<commit_message>
Demo fixtures: the synthesis title fits one line in the pane; the PRD terminal's prompt no longer wraps
Co-Authored-By: Claude Opus 5.5 <noreply@anthropic.com>
Claude-Session: https://claude.ai/code/session_01T7qxTYsSVreoCbVkvqVb6X
</commit_message>
<xml_diff>
--- a/video/fixture/docs/docs/beta-interview-synthesis.docx
+++ b/video/fixture/docs/docs/beta-interview-synthesis.docx
@@ -893,7 +893,7 @@
       <w:color w:val="0F5C4D"/>
       <w:spacing w:val="5"/>
       <w:kern w:val="28"/>
-      <w:sz w:val="52"/>
+      <w:sz w:val="44"/>
       <w:szCs w:val="52"/>
     </w:rPr>
   </w:style>
@@ -909,7 +909,7 @@
       <w:color w:val="0F5C4D"/>
       <w:spacing w:val="5"/>
       <w:kern w:val="28"/>
-      <w:sz w:val="52"/>
+      <w:sz w:val="44"/>
       <w:szCs w:val="52"/>
     </w:rPr>
   </w:style>

</xml_diff>